<commit_message>
Updated script to more accurately calculate before/after disk space calculations and to delete older files AS their replacements are successfully downloaded
</commit_message>
<xml_diff>
--- a/user_guide.docx
+++ b/user_guide.docx
@@ -2,7 +2,7 @@
 <file path=word/document.xml><?xml version="1.0" encoding="utf-8"?>
 <w:document xmlns:w="http://schemas.openxmlformats.org/wordprocessingml/2006/main" xmlns:m="http://schemas.openxmlformats.org/officeDocument/2006/math" xmlns:r="http://schemas.openxmlformats.org/officeDocument/2006/relationships" xmlns:o="urn:schemas-microsoft-com:office:office" xmlns:v="urn:schemas-microsoft-com:vml" xmlns:w10="urn:schemas-microsoft-com:office:word" xmlns:a="http://schemas.openxmlformats.org/drawingml/2006/main" xmlns:pic="http://schemas.openxmlformats.org/drawingml/2006/picture" xmlns:wp="http://schemas.openxmlformats.org/drawingml/2006/wordprocessingDrawing">
   <w:body>
-    <w:bookmarkStart w:id="56" w:name="kiwix-english-best-user-guide"/>
+    <w:bookmarkStart w:id="60" w:name="kiwix-english-best-user-guide"/>
     <w:p>
       <w:pPr>
         <w:pStyle w:val="Heading1"/>
@@ -26,7 +26,7 @@
         <w:t xml:space="preserve"> </w:t>
       </w:r>
       <w:r>
-        <w:t xml:space="preserve">v20260822a</w:t>
+        <w:t xml:space="preserve">v20260822b</w:t>
       </w:r>
       <w:r>
         <w:br/>
@@ -222,6 +222,23 @@
         </w:numPr>
         <w:pStyle w:val="Compact"/>
       </w:pPr>
+      <w:hyperlink w:anchor="space-checks-and-immediate-cleanup">
+        <w:r>
+          <w:rPr>
+            <w:rStyle w:val="Hyperlink"/>
+          </w:rPr>
+          <w:t xml:space="preserve">Space Checks and Immediate Cleanup</w:t>
+        </w:r>
+      </w:hyperlink>
+    </w:p>
+    <w:p>
+      <w:pPr>
+        <w:numPr>
+          <w:ilvl w:val="0"/>
+          <w:numId w:val="1001"/>
+        </w:numPr>
+        <w:pStyle w:val="Compact"/>
+      </w:pPr>
       <w:hyperlink w:anchor="non-interactive-mode">
         <w:r>
           <w:rPr>
@@ -462,7 +479,39 @@
         <w:pStyle w:val="Compact"/>
       </w:pPr>
       <w:r>
-        <w:t xml:space="preserve">Cleans up older duplicate versions to save disk space</w:t>
+        <w:rPr>
+          <w:bCs/>
+          <w:b/>
+        </w:rPr>
+        <w:t xml:space="preserve">Deletes outdated versions immediately</w:t>
+      </w:r>
+      <w:r>
+        <w:t xml:space="preserve"> </w:t>
+      </w:r>
+      <w:r>
+        <w:t xml:space="preserve">after each replacement is verified (one file at a time, not at session end)</w:t>
+      </w:r>
+    </w:p>
+    <w:p>
+      <w:pPr>
+        <w:numPr>
+          <w:ilvl w:val="0"/>
+          <w:numId w:val="1003"/>
+        </w:numPr>
+        <w:pStyle w:val="Compact"/>
+      </w:pPr>
+      <w:r>
+        <w:rPr>
+          <w:bCs/>
+          <w:b/>
+        </w:rPr>
+        <w:t xml:space="preserve">Accounts for reclaimable disk space</w:t>
+      </w:r>
+      <w:r>
+        <w:t xml:space="preserve"> </w:t>
+      </w:r>
+      <w:r>
+        <w:t xml:space="preserve">when calculating required free space (subtracts size of old versions that will be replaced)</w:t>
       </w:r>
     </w:p>
     <w:p>
@@ -778,7 +827,7 @@
         <w:rPr>
           <w:rStyle w:val="NormalTok"/>
         </w:rPr>
-        <w:t xml:space="preserve"> kiwix_english_best_v20260822a.py</w:t>
+        <w:t xml:space="preserve"> kiwix_english_best_v20260822b.py</w:t>
       </w:r>
     </w:p>
     <w:p>
@@ -797,7 +846,7 @@
         <w:rPr>
           <w:rStyle w:val="VerbatimChar"/>
         </w:rPr>
-        <w:t xml:space="preserve">Kiwix English ZIM Tool v20260822a</w:t>
+        <w:t xml:space="preserve">Kiwix English ZIM Tool v20260822b</w:t>
       </w:r>
       <w:r>
         <w:br/>
@@ -999,7 +1048,19 @@
         <w:pStyle w:val="Compact"/>
       </w:pPr>
       <w:r>
-        <w:t xml:space="preserve">If files are missing, shows a space check and prompts to download</w:t>
+        <w:t xml:space="preserve">If files are missing, shows a space check (including reclaimable space from any older same-group files) and prompts to download</w:t>
+      </w:r>
+    </w:p>
+    <w:p>
+      <w:pPr>
+        <w:numPr>
+          <w:ilvl w:val="0"/>
+          <w:numId w:val="1004"/>
+        </w:numPr>
+        <w:pStyle w:val="Compact"/>
+      </w:pPr>
+      <w:r>
+        <w:t xml:space="preserve">After each successful download, immediately deletes any older version in the same group</w:t>
       </w:r>
     </w:p>
     <w:p>
@@ -1256,7 +1317,7 @@
         <w:pStyle w:val="Compact"/>
       </w:pPr>
       <w:r>
-        <w:t xml:space="preserve">Shows a space check for remaining files</w:t>
+        <w:t xml:space="preserve">Shows a space check for remaining files (gross size, reclaimable from old versions, net + buffer)</w:t>
       </w:r>
     </w:p>
     <w:p>
@@ -1284,6 +1345,18 @@
       </w:r>
       <w:r>
         <w:t xml:space="preserve">files where they exist</w:t>
+      </w:r>
+    </w:p>
+    <w:p>
+      <w:pPr>
+        <w:numPr>
+          <w:ilvl w:val="0"/>
+          <w:numId w:val="1005"/>
+        </w:numPr>
+        <w:pStyle w:val="Compact"/>
+      </w:pPr>
+      <w:r>
+        <w:t xml:space="preserve">After each successful download, immediately deletes any older version in the same group</w:t>
       </w:r>
     </w:p>
     <w:p>
@@ -1608,13 +1681,51 @@
           <w:bCs/>
           <w:b/>
         </w:rPr>
+        <w:t xml:space="preserve">Shows a space check</w:t>
+      </w:r>
+      <w:r>
+        <w:t xml:space="preserve"> </w:t>
+      </w:r>
+      <w:r>
+        <w:t xml:space="preserve">that subtracts reclaimable space from outdated files that will be replaced</w:t>
+      </w:r>
+    </w:p>
+    <w:p>
+      <w:pPr>
+        <w:numPr>
+          <w:ilvl w:val="0"/>
+          <w:numId w:val="1006"/>
+        </w:numPr>
+        <w:pStyle w:val="Compact"/>
+      </w:pPr>
+      <w:r>
+        <w:rPr>
+          <w:bCs/>
+          <w:b/>
+        </w:rPr>
         <w:t xml:space="preserve">Downloads</w:t>
       </w:r>
       <w:r>
         <w:t xml:space="preserve"> </w:t>
       </w:r>
       <w:r>
-        <w:t xml:space="preserve">updates and new groups with per-file cleanup of the old version immediately after each new file completes verification</w:t>
+        <w:t xml:space="preserve">updates and new groups;</w:t>
+      </w:r>
+      <w:r>
+        <w:t xml:space="preserve"> </w:t>
+      </w:r>
+      <w:r>
+        <w:rPr>
+          <w:bCs/>
+          <w:b/>
+        </w:rPr>
+        <w:t xml:space="preserve">deletes each outdated predecessor immediately</w:t>
+      </w:r>
+      <w:r>
+        <w:t xml:space="preserve"> </w:t>
+      </w:r>
+      <w:r>
+        <w:t xml:space="preserve">after its replacement is verified (one file at a time, not at session end)</w:t>
       </w:r>
     </w:p>
     <w:p>
@@ -1868,7 +1979,7 @@
         <w:t xml:space="preserve"> </w:t>
       </w:r>
       <w:r>
-        <w:t xml:space="preserve">after each file is verified — so if the session is interrupted, already-completed updates are cleaned up</w:t>
+        <w:t xml:space="preserve">after each file is verified — so if the session is interrupted, already-completed updates have already freed their old space</w:t>
       </w:r>
     </w:p>
     <w:p>
@@ -1930,7 +2041,7 @@
         <w:t xml:space="preserve"> </w:t>
       </w:r>
       <w:r>
-        <w:t xml:space="preserve">If you have accumulated older duplicate versions of ZIM files (e.g. after manually downloading without using Option 3’s auto-cleanup).</w:t>
+        <w:t xml:space="preserve">If you have accumulated older duplicate versions of ZIM files (e.g. after manually copying files without using the script’s auto-cleanup).</w:t>
       </w:r>
     </w:p>
     <w:p>
@@ -2721,13 +2832,22 @@
       </w:r>
     </w:p>
     <w:bookmarkEnd w:id="30"/>
-    <w:bookmarkStart w:id="34" w:name="non-interactive-mode"/>
+    <w:bookmarkStart w:id="33" w:name="space-checks-and-immediate-cleanup"/>
     <w:p>
       <w:pPr>
         <w:pStyle w:val="Heading2"/>
       </w:pPr>
       <w:r>
-        <w:t xml:space="preserve">Non-Interactive Update Mode (Cron Jobs)</w:t>
+        <w:t xml:space="preserve">Space Checks and Immediate Cleanup</w:t>
+      </w:r>
+    </w:p>
+    <w:bookmarkStart w:id="31" w:name="space-check-breakdown"/>
+    <w:p>
+      <w:pPr>
+        <w:pStyle w:val="Heading3"/>
+      </w:pPr>
+      <w:r>
+        <w:t xml:space="preserve">Space check breakdown</w:t>
       </w:r>
     </w:p>
     <w:p>
@@ -2735,316 +2855,7 @@
         <w:pStyle w:val="FirstParagraph"/>
       </w:pPr>
       <w:r>
-        <w:t xml:space="preserve">The script supports a fully non-interactive update mode suitable for automated scheduling via cron or any task scheduler.</w:t>
-      </w:r>
-    </w:p>
-    <w:bookmarkStart w:id="31" w:name="usage"/>
-    <w:p>
-      <w:pPr>
-        <w:pStyle w:val="Heading3"/>
-      </w:pPr>
-      <w:r>
-        <w:t xml:space="preserve">Usage</w:t>
-      </w:r>
-    </w:p>
-    <w:p>
-      <w:pPr>
-        <w:pStyle w:val="SourceCode"/>
-      </w:pPr>
-      <w:r>
-        <w:rPr>
-          <w:rStyle w:val="ExtensionTok"/>
-        </w:rPr>
-        <w:t xml:space="preserve">python3</w:t>
-      </w:r>
-      <w:r>
-        <w:rPr>
-          <w:rStyle w:val="NormalTok"/>
-        </w:rPr>
-        <w:t xml:space="preserve"> kiwix_english_best_v20260822a.py </w:t>
-      </w:r>
-      <w:r>
-        <w:rPr>
-          <w:rStyle w:val="AttributeTok"/>
-        </w:rPr>
-        <w:t xml:space="preserve">-u</w:t>
-      </w:r>
-      <w:r>
-        <w:br/>
-      </w:r>
-      <w:r>
-        <w:rPr>
-          <w:rStyle w:val="CommentTok"/>
-        </w:rPr>
-        <w:t xml:space="preserve"># or</w:t>
-      </w:r>
-      <w:r>
-        <w:br/>
-      </w:r>
-      <w:r>
-        <w:rPr>
-          <w:rStyle w:val="ExtensionTok"/>
-        </w:rPr>
-        <w:t xml:space="preserve">python3</w:t>
-      </w:r>
-      <w:r>
-        <w:rPr>
-          <w:rStyle w:val="NormalTok"/>
-        </w:rPr>
-        <w:t xml:space="preserve"> kiwix_english_best_v20260822a.py </w:t>
-      </w:r>
-      <w:r>
-        <w:rPr>
-          <w:rStyle w:val="AttributeTok"/>
-        </w:rPr>
-        <w:t xml:space="preserve">--update</w:t>
-      </w:r>
-    </w:p>
-    <w:bookmarkEnd w:id="31"/>
-    <w:bookmarkStart w:id="32" w:name="behaviour"/>
-    <w:p>
-      <w:pPr>
-        <w:pStyle w:val="Heading3"/>
-      </w:pPr>
-      <w:r>
-        <w:t xml:space="preserve">Behaviour</w:t>
-      </w:r>
-    </w:p>
-    <w:p>
-      <w:pPr>
-        <w:numPr>
-          <w:ilvl w:val="0"/>
-          <w:numId w:val="1010"/>
-        </w:numPr>
-        <w:pStyle w:val="Compact"/>
-      </w:pPr>
-      <w:r>
-        <w:rPr>
-          <w:bCs/>
-          <w:b/>
-        </w:rPr>
-        <w:t xml:space="preserve">Exits silently</w:t>
-      </w:r>
-      <w:r>
-        <w:t xml:space="preserve"> </w:t>
-      </w:r>
-      <w:r>
-        <w:t xml:space="preserve">(exit code 0) if the</w:t>
-      </w:r>
-      <w:r>
-        <w:t xml:space="preserve"> </w:t>
-      </w:r>
-      <w:r>
-        <w:rPr>
-          <w:rStyle w:val="VerbatimChar"/>
-        </w:rPr>
-        <w:t xml:space="preserve">zims/</w:t>
-      </w:r>
-      <w:r>
-        <w:t xml:space="preserve"> </w:t>
-      </w:r>
-      <w:r>
-        <w:t xml:space="preserve">directory does not exist — this prevents cron from sending failure emails when the storage volume is not mounted (e.g. VeraCrypt volume not unlocked)</w:t>
-      </w:r>
-    </w:p>
-    <w:p>
-      <w:pPr>
-        <w:numPr>
-          <w:ilvl w:val="0"/>
-          <w:numId w:val="1010"/>
-        </w:numPr>
-        <w:pStyle w:val="Compact"/>
-      </w:pPr>
-      <w:r>
-        <w:t xml:space="preserve">If</w:t>
-      </w:r>
-      <w:r>
-        <w:t xml:space="preserve"> </w:t>
-      </w:r>
-      <w:r>
-        <w:rPr>
-          <w:rStyle w:val="VerbatimChar"/>
-        </w:rPr>
-        <w:t xml:space="preserve">kiwix_resume_update.txt</w:t>
-      </w:r>
-      <w:r>
-        <w:t xml:space="preserve"> </w:t>
-      </w:r>
-      <w:r>
-        <w:t xml:space="preserve">exists, resumes the incomplete session</w:t>
-      </w:r>
-    </w:p>
-    <w:p>
-      <w:pPr>
-        <w:numPr>
-          <w:ilvl w:val="0"/>
-          <w:numId w:val="1010"/>
-        </w:numPr>
-        <w:pStyle w:val="Compact"/>
-      </w:pPr>
-      <w:r>
-        <w:t xml:space="preserve">Otherwise crawls the server and downloads all updates and new groups</w:t>
-      </w:r>
-    </w:p>
-    <w:p>
-      <w:pPr>
-        <w:numPr>
-          <w:ilvl w:val="0"/>
-          <w:numId w:val="1010"/>
-        </w:numPr>
-        <w:pStyle w:val="Compact"/>
-      </w:pPr>
-      <w:r>
-        <w:t xml:space="preserve">Non-verbose output (clean for log files)</w:t>
-      </w:r>
-    </w:p>
-    <w:p>
-      <w:pPr>
-        <w:numPr>
-          <w:ilvl w:val="0"/>
-          <w:numId w:val="1010"/>
-        </w:numPr>
-        <w:pStyle w:val="Compact"/>
-      </w:pPr>
-      <w:r>
-        <w:t xml:space="preserve">Exits with code 1 if there is insufficient disk space or the server crawl fails</w:t>
-      </w:r>
-    </w:p>
-    <w:bookmarkEnd w:id="32"/>
-    <w:bookmarkStart w:id="33" w:name="example-cron-entry"/>
-    <w:p>
-      <w:pPr>
-        <w:pStyle w:val="Heading3"/>
-      </w:pPr>
-      <w:r>
-        <w:t xml:space="preserve">Example Cron Entry</w:t>
-      </w:r>
-    </w:p>
-    <w:p>
-      <w:pPr>
-        <w:pStyle w:val="FirstParagraph"/>
-      </w:pPr>
-      <w:r>
-        <w:t xml:space="preserve">To run every Sunday at 3:00 AM and log output:</w:t>
-      </w:r>
-    </w:p>
-    <w:p>
-      <w:pPr>
-        <w:pStyle w:val="SourceCode"/>
-      </w:pPr>
-      <w:r>
-        <w:rPr>
-          <w:rStyle w:val="ExtensionTok"/>
-        </w:rPr>
-        <w:t xml:space="preserve">0</w:t>
-      </w:r>
-      <w:r>
-        <w:rPr>
-          <w:rStyle w:val="NormalTok"/>
-        </w:rPr>
-        <w:t xml:space="preserve"> 3 </w:t>
-      </w:r>
-      <w:r>
-        <w:rPr>
-          <w:rStyle w:val="PreprocessorTok"/>
-        </w:rPr>
-        <w:t xml:space="preserve">*</w:t>
-      </w:r>
-      <w:r>
-        <w:rPr>
-          <w:rStyle w:val="NormalTok"/>
-        </w:rPr>
-        <w:t xml:space="preserve"> </w:t>
-      </w:r>
-      <w:r>
-        <w:rPr>
-          <w:rStyle w:val="PreprocessorTok"/>
-        </w:rPr>
-        <w:t xml:space="preserve">*</w:t>
-      </w:r>
-      <w:r>
-        <w:rPr>
-          <w:rStyle w:val="NormalTok"/>
-        </w:rPr>
-        <w:t xml:space="preserve"> 0  python3 /path/to/kiwix_english_best_v20260822a.py </w:t>
-      </w:r>
-      <w:r>
-        <w:rPr>
-          <w:rStyle w:val="AttributeTok"/>
-        </w:rPr>
-        <w:t xml:space="preserve">-u</w:t>
-      </w:r>
-      <w:r>
-        <w:rPr>
-          <w:rStyle w:val="NormalTok"/>
-        </w:rPr>
-        <w:t xml:space="preserve"> </w:t>
-      </w:r>
-      <w:r>
-        <w:rPr>
-          <w:rStyle w:val="OperatorTok"/>
-        </w:rPr>
-        <w:t xml:space="preserve">&gt;&gt;</w:t>
-      </w:r>
-      <w:r>
-        <w:rPr>
-          <w:rStyle w:val="NormalTok"/>
-        </w:rPr>
-        <w:t xml:space="preserve"> /path/to/kiwix_cron.log </w:t>
-      </w:r>
-      <w:r>
-        <w:rPr>
-          <w:rStyle w:val="DecValTok"/>
-        </w:rPr>
-        <w:t xml:space="preserve">2</w:t>
-      </w:r>
-      <w:r>
-        <w:rPr>
-          <w:rStyle w:val="OperatorTok"/>
-        </w:rPr>
-        <w:t xml:space="preserve">&gt;&amp;</w:t>
-      </w:r>
-      <w:r>
-        <w:rPr>
-          <w:rStyle w:val="DecValTok"/>
-        </w:rPr>
-        <w:t xml:space="preserve">1</w:t>
-      </w:r>
-    </w:p>
-    <w:p>
-      <w:pPr>
-        <w:pStyle w:val="FirstParagraph"/>
-      </w:pPr>
-      <w:r>
-        <w:rPr>
-          <w:bCs/>
-          <w:b/>
-        </w:rPr>
-        <w:t xml:space="preserve">Important:</w:t>
-      </w:r>
-      <w:r>
-        <w:t xml:space="preserve"> </w:t>
-      </w:r>
-      <w:r>
-        <w:t xml:space="preserve">If your ZIM files are on an encrypted volume (e.g. VeraCrypt), the volume must already be mounted when the cron job runs. The script will exit gracefully if it is not.</w:t>
-      </w:r>
-    </w:p>
-    <w:p>
-      <w:r>
-        <w:pict>
-          <v:rect style="width:0;height:1.5pt" o:hralign="center" o:hrstd="t" o:hr="t"/>
-        </w:pict>
-      </w:r>
-    </w:p>
-    <w:bookmarkEnd w:id="33"/>
-    <w:bookmarkEnd w:id="34"/>
-    <w:bookmarkStart w:id="36" w:name="file-reference"/>
-    <w:p>
-      <w:pPr>
-        <w:pStyle w:val="Heading2"/>
-      </w:pPr>
-      <w:r>
-        <w:t xml:space="preserve">File Reference</w:t>
+        <w:t xml:space="preserve">Before every download session (Options 1, 2, 3, and cron mode), the script reports:</w:t>
       </w:r>
     </w:p>
     <w:tbl>
@@ -3070,19 +2881,19 @@
               <w:jc w:val="left"/>
             </w:pPr>
             <w:r>
-              <w:t xml:space="preserve">File</w:t>
-            </w:r>
-          </w:p>
-        </w:tc>
-        <w:tc>
-          <w:tcPr/>
-          <w:p>
-            <w:pPr>
-              <w:pStyle w:val="Compact"/>
-              <w:jc w:val="left"/>
-            </w:pPr>
-            <w:r>
-              <w:t xml:space="preserve">Description</w:t>
+              <w:t xml:space="preserve">Line</w:t>
+            </w:r>
+          </w:p>
+        </w:tc>
+        <w:tc>
+          <w:tcPr/>
+          <w:p>
+            <w:pPr>
+              <w:pStyle w:val="Compact"/>
+              <w:jc w:val="left"/>
+            </w:pPr>
+            <w:r>
+              <w:t xml:space="preserve">Meaning</w:t>
             </w:r>
           </w:p>
         </w:tc>
@@ -3095,6 +2906,127 @@
               <w:pStyle w:val="Compact"/>
               <w:jc w:val="left"/>
             </w:pPr>
+            <w:r>
+              <w:rPr>
+                <w:bCs/>
+                <w:b/>
+              </w:rPr>
+              <w:t xml:space="preserve">Download size (gross)</w:t>
+            </w:r>
+          </w:p>
+        </w:tc>
+        <w:tc>
+          <w:tcPr/>
+          <w:p>
+            <w:pPr>
+              <w:pStyle w:val="Compact"/>
+              <w:jc w:val="left"/>
+            </w:pPr>
+            <w:r>
+              <w:t xml:space="preserve">Bytes still to write for incomplete or missing files</w:t>
+            </w:r>
+          </w:p>
+        </w:tc>
+      </w:tr>
+      <w:tr>
+        <w:tc>
+          <w:tcPr/>
+          <w:p>
+            <w:pPr>
+              <w:pStyle w:val="Compact"/>
+              <w:jc w:val="left"/>
+            </w:pPr>
+            <w:r>
+              <w:rPr>
+                <w:bCs/>
+                <w:b/>
+              </w:rPr>
+              <w:t xml:space="preserve">Reclaimed from old versions</w:t>
+            </w:r>
+          </w:p>
+        </w:tc>
+        <w:tc>
+          <w:tcPr/>
+          <w:p>
+            <w:pPr>
+              <w:pStyle w:val="Compact"/>
+              <w:jc w:val="left"/>
+            </w:pPr>
+            <w:r>
+              <w:t xml:space="preserve">On-disk size of same-group files that will be deleted when replacements succeed (lists filenames)</w:t>
+            </w:r>
+          </w:p>
+        </w:tc>
+      </w:tr>
+      <w:tr>
+        <w:tc>
+          <w:tcPr/>
+          <w:p>
+            <w:pPr>
+              <w:pStyle w:val="Compact"/>
+              <w:jc w:val="left"/>
+            </w:pPr>
+            <w:r>
+              <w:rPr>
+                <w:bCs/>
+                <w:b/>
+              </w:rPr>
+              <w:t xml:space="preserve">Required (net + buffer)</w:t>
+            </w:r>
+          </w:p>
+        </w:tc>
+        <w:tc>
+          <w:tcPr/>
+          <w:p>
+            <w:pPr>
+              <w:pStyle w:val="Compact"/>
+              <w:jc w:val="left"/>
+            </w:pPr>
+            <w:r>
+              <w:rPr>
+                <w:rStyle w:val="VerbatimChar"/>
+              </w:rPr>
+              <w:t xml:space="preserve">max(0, gross − reclaimed) + safety buffer</w:t>
+            </w:r>
+            <w:r>
+              <w:t xml:space="preserve"> </w:t>
+            </w:r>
+            <w:r>
+              <w:t xml:space="preserve">(default 10 GiB, or 10% of net, whichever is larger)</w:t>
+            </w:r>
+          </w:p>
+        </w:tc>
+      </w:tr>
+      <w:tr>
+        <w:tc>
+          <w:tcPr/>
+          <w:p>
+            <w:pPr>
+              <w:pStyle w:val="Compact"/>
+              <w:jc w:val="left"/>
+            </w:pPr>
+            <w:r>
+              <w:rPr>
+                <w:bCs/>
+                <w:b/>
+              </w:rPr>
+              <w:t xml:space="preserve">Available</w:t>
+            </w:r>
+          </w:p>
+        </w:tc>
+        <w:tc>
+          <w:tcPr/>
+          <w:p>
+            <w:pPr>
+              <w:pStyle w:val="Compact"/>
+              <w:jc w:val="left"/>
+            </w:pPr>
+            <w:r>
+              <w:t xml:space="preserve">Free space on the volume holding</w:t>
+            </w:r>
+            <w:r>
+              <w:t xml:space="preserve"> </w:t>
+            </w:r>
             <w:r>
               <w:rPr>
                 <w:rStyle w:val="VerbatimChar"/>
@@ -3103,230 +3035,118 @@
             </w:r>
           </w:p>
         </w:tc>
-        <w:tc>
-          <w:tcPr/>
-          <w:p>
-            <w:pPr>
-              <w:pStyle w:val="Compact"/>
-              <w:jc w:val="left"/>
-            </w:pPr>
-            <w:r>
-              <w:t xml:space="preserve">Directory where all ZIM files are stored</w:t>
-            </w:r>
-          </w:p>
-        </w:tc>
-      </w:tr>
-      <w:tr>
-        <w:tc>
-          <w:tcPr/>
-          <w:p>
-            <w:pPr>
-              <w:pStyle w:val="Compact"/>
-              <w:jc w:val="left"/>
-            </w:pPr>
-            <w:r>
-              <w:rPr>
-                <w:rStyle w:val="VerbatimChar"/>
-              </w:rPr>
-              <w:t xml:space="preserve">zims/*.zim</w:t>
-            </w:r>
-          </w:p>
-        </w:tc>
-        <w:tc>
-          <w:tcPr/>
-          <w:p>
-            <w:pPr>
-              <w:pStyle w:val="Compact"/>
-              <w:jc w:val="left"/>
-            </w:pPr>
-            <w:r>
-              <w:t xml:space="preserve">Completed, verified ZIM files</w:t>
-            </w:r>
-          </w:p>
-        </w:tc>
-      </w:tr>
-      <w:tr>
-        <w:tc>
-          <w:tcPr/>
-          <w:p>
-            <w:pPr>
-              <w:pStyle w:val="Compact"/>
-              <w:jc w:val="left"/>
-            </w:pPr>
-            <w:r>
-              <w:rPr>
-                <w:rStyle w:val="VerbatimChar"/>
-              </w:rPr>
-              <w:t xml:space="preserve">zims/*.zim.partial</w:t>
-            </w:r>
-          </w:p>
-        </w:tc>
-        <w:tc>
-          <w:tcPr/>
-          <w:p>
-            <w:pPr>
-              <w:pStyle w:val="Compact"/>
-              <w:jc w:val="left"/>
-            </w:pPr>
-            <w:r>
-              <w:t xml:space="preserve">Incomplete downloads — safe to leave in place; will be resumed automatically</w:t>
-            </w:r>
-          </w:p>
-        </w:tc>
-      </w:tr>
-      <w:tr>
-        <w:tc>
-          <w:tcPr/>
-          <w:p>
-            <w:pPr>
-              <w:pStyle w:val="Compact"/>
-              <w:jc w:val="left"/>
-            </w:pPr>
-            <w:r>
-              <w:rPr>
-                <w:rStyle w:val="VerbatimChar"/>
-              </w:rPr>
-              <w:t xml:space="preserve">zims/*.zim.fastresume</w:t>
-            </w:r>
-          </w:p>
-        </w:tc>
-        <w:tc>
-          <w:tcPr/>
-          <w:p>
-            <w:pPr>
-              <w:pStyle w:val="Compact"/>
-              <w:jc w:val="left"/>
-            </w:pPr>
-            <w:r>
-              <w:t xml:space="preserve">Torrent resume data — deleted automatically on completion</w:t>
-            </w:r>
-          </w:p>
-        </w:tc>
-      </w:tr>
-      <w:tr>
-        <w:tc>
-          <w:tcPr/>
-          <w:p>
-            <w:pPr>
-              <w:pStyle w:val="Compact"/>
-              <w:jc w:val="left"/>
-            </w:pPr>
-            <w:r>
-              <w:rPr>
-                <w:rStyle w:val="VerbatimChar"/>
-              </w:rPr>
-              <w:t xml:space="preserve">zims/corrupt/</w:t>
-            </w:r>
-          </w:p>
-        </w:tc>
-        <w:tc>
-          <w:tcPr/>
-          <w:p>
-            <w:pPr>
-              <w:pStyle w:val="Compact"/>
-              <w:jc w:val="left"/>
-            </w:pPr>
-            <w:r>
-              <w:t xml:space="preserve">Files that failed integrity verification</w:t>
-            </w:r>
-          </w:p>
-        </w:tc>
-      </w:tr>
-      <w:tr>
-        <w:tc>
-          <w:tcPr/>
-          <w:p>
-            <w:pPr>
-              <w:pStyle w:val="Compact"/>
-              <w:jc w:val="left"/>
-            </w:pPr>
-            <w:r>
-              <w:rPr>
-                <w:rStyle w:val="VerbatimChar"/>
-              </w:rPr>
-              <w:t xml:space="preserve">kiwix_english_best.txt</w:t>
-            </w:r>
-          </w:p>
-        </w:tc>
-        <w:tc>
-          <w:tcPr/>
-          <w:p>
-            <w:pPr>
-              <w:pStyle w:val="Compact"/>
-              <w:jc w:val="left"/>
-            </w:pPr>
-            <w:r>
-              <w:t xml:space="preserve">Full best-file list generated by Option 1</w:t>
-            </w:r>
-          </w:p>
-        </w:tc>
-      </w:tr>
-      <w:tr>
-        <w:tc>
-          <w:tcPr/>
-          <w:p>
-            <w:pPr>
-              <w:pStyle w:val="Compact"/>
-              <w:jc w:val="left"/>
-            </w:pPr>
-            <w:r>
-              <w:rPr>
-                <w:rStyle w:val="VerbatimChar"/>
-              </w:rPr>
-              <w:t xml:space="preserve">kiwix_resume_update.txt</w:t>
-            </w:r>
-          </w:p>
-        </w:tc>
-        <w:tc>
-          <w:tcPr/>
-          <w:p>
-            <w:pPr>
-              <w:pStyle w:val="Compact"/>
-              <w:jc w:val="left"/>
-            </w:pPr>
-            <w:r>
-              <w:t xml:space="preserve">Incomplete update session resume file — written by Option 3, deleted on full completion</w:t>
-            </w:r>
-          </w:p>
-        </w:tc>
-      </w:tr>
-      <w:tr>
-        <w:tc>
-          <w:tcPr/>
-          <w:p>
-            <w:pPr>
-              <w:pStyle w:val="Compact"/>
-              <w:jc w:val="left"/>
-            </w:pPr>
-            <w:r>
-              <w:rPr>
-                <w:rStyle w:val="VerbatimChar"/>
-              </w:rPr>
-              <w:t xml:space="preserve">kiwix_download_failures.log</w:t>
-            </w:r>
-          </w:p>
-        </w:tc>
-        <w:tc>
-          <w:tcPr/>
-          <w:p>
-            <w:pPr>
-              <w:pStyle w:val="Compact"/>
-              <w:jc w:val="left"/>
-            </w:pPr>
-            <w:r>
-              <w:t xml:space="preserve">Log of all download failures with timestamps and error details</w:t>
-            </w:r>
-          </w:p>
-        </w:tc>
       </w:tr>
     </w:tbl>
-    <w:bookmarkStart w:id="35" w:name="list-file-format"/>
+    <w:p>
+      <w:pPr>
+        <w:pStyle w:val="BodyText"/>
+      </w:pPr>
+      <w:r>
+        <w:t xml:space="preserve">Example:</w:t>
+      </w:r>
+    </w:p>
+    <w:p>
+      <w:pPr>
+        <w:pStyle w:val="SourceCode"/>
+      </w:pPr>
+      <w:r>
+        <w:rPr>
+          <w:rStyle w:val="VerbatimChar"/>
+        </w:rPr>
+        <w:t xml:space="preserve">Space check for updates:</w:t>
+      </w:r>
+      <w:r>
+        <w:br/>
+      </w:r>
+      <w:r>
+        <w:rPr>
+          <w:rStyle w:val="VerbatimChar"/>
+        </w:rPr>
+        <w:t xml:space="preserve">  Files to download: 3</w:t>
+      </w:r>
+      <w:r>
+        <w:br/>
+      </w:r>
+      <w:r>
+        <w:rPr>
+          <w:rStyle w:val="VerbatimChar"/>
+        </w:rPr>
+        <w:t xml:space="preserve">  Download size (gross): ~669.90 GiB</w:t>
+      </w:r>
+      <w:r>
+        <w:br/>
+      </w:r>
+      <w:r>
+        <w:rPr>
+          <w:rStyle w:val="VerbatimChar"/>
+        </w:rPr>
+        <w:t xml:space="preserve">  Reclaimed from old versions: ~612.00 GiB (2 file(s))</w:t>
+      </w:r>
+      <w:r>
+        <w:br/>
+      </w:r>
+      <w:r>
+        <w:rPr>
+          <w:rStyle w:val="VerbatimChar"/>
+        </w:rPr>
+        <w:t xml:space="preserve">    - gutenberg_en_all_2025-11.zim (206.00 GiB) → replaced by gutenberg_en_all_2026-03.zim</w:t>
+      </w:r>
+      <w:r>
+        <w:br/>
+      </w:r>
+      <w:r>
+        <w:rPr>
+          <w:rStyle w:val="VerbatimChar"/>
+        </w:rPr>
+        <w:t xml:space="preserve">    - wikipedia_en_all_maxi_2026-01.zim (406.00 GiB) → replaced by wikipedia_en_all_maxi_2026-07.zim</w:t>
+      </w:r>
+      <w:r>
+        <w:br/>
+      </w:r>
+      <w:r>
+        <w:rPr>
+          <w:rStyle w:val="VerbatimChar"/>
+        </w:rPr>
+        <w:t xml:space="preserve">  Required (net + 10 GiB buffer): ~67.90 GiB</w:t>
+      </w:r>
+      <w:r>
+        <w:br/>
+      </w:r>
+      <w:r>
+        <w:rPr>
+          <w:rStyle w:val="VerbatimChar"/>
+        </w:rPr>
+        <w:t xml:space="preserve">  Available: ~1.08 TiB</w:t>
+      </w:r>
+    </w:p>
+    <w:p>
+      <w:pPr>
+        <w:pStyle w:val="FirstParagraph"/>
+      </w:pPr>
+      <w:r>
+        <w:t xml:space="preserve">If there are no older versions to replace, the reclaim line shows</w:t>
+      </w:r>
+      <w:r>
+        <w:t xml:space="preserve"> </w:t>
+      </w:r>
+      <w:r>
+        <w:rPr>
+          <w:rStyle w:val="VerbatimChar"/>
+        </w:rPr>
+        <w:t xml:space="preserve">none</w:t>
+      </w:r>
+      <w:r>
+        <w:t xml:space="preserve">.</w:t>
+      </w:r>
+    </w:p>
+    <w:bookmarkEnd w:id="31"/>
+    <w:bookmarkStart w:id="32" w:name="immediate-per-file-cleanup"/>
     <w:p>
       <w:pPr>
         <w:pStyle w:val="Heading3"/>
       </w:pPr>
       <w:r>
-        <w:t xml:space="preserve">List File Format</w:t>
+        <w:t xml:space="preserve">Immediate per-file cleanup</w:t>
       </w:r>
     </w:p>
     <w:p>
@@ -3334,31 +3154,51 @@
         <w:pStyle w:val="FirstParagraph"/>
       </w:pPr>
       <w:r>
-        <w:rPr>
-          <w:rStyle w:val="VerbatimChar"/>
-        </w:rPr>
-        <w:t xml:space="preserve">kiwix_english_best.txt</w:t>
-      </w:r>
-      <w:r>
-        <w:t xml:space="preserve"> </w:t>
-      </w:r>
-      <w:r>
-        <w:t xml:space="preserve">and</w:t>
-      </w:r>
-      <w:r>
-        <w:t xml:space="preserve"> </w:t>
-      </w:r>
-      <w:r>
-        <w:rPr>
-          <w:rStyle w:val="VerbatimChar"/>
-        </w:rPr>
-        <w:t xml:space="preserve">kiwix_resume_update.txt</w:t>
-      </w:r>
-      <w:r>
-        <w:t xml:space="preserve"> </w:t>
-      </w:r>
-      <w:r>
-        <w:t xml:space="preserve">use a pipe-delimited format:</w:t>
+        <w:t xml:space="preserve">After</w:t>
+      </w:r>
+      <w:r>
+        <w:t xml:space="preserve"> </w:t>
+      </w:r>
+      <w:r>
+        <w:rPr>
+          <w:bCs/>
+          <w:b/>
+        </w:rPr>
+        <w:t xml:space="preserve">each</w:t>
+      </w:r>
+      <w:r>
+        <w:t xml:space="preserve"> </w:t>
+      </w:r>
+      <w:r>
+        <w:t xml:space="preserve">successful download and integrity verification — in any menu option — the script deletes older same-group</w:t>
+      </w:r>
+      <w:r>
+        <w:t xml:space="preserve"> </w:t>
+      </w:r>
+      <w:r>
+        <w:rPr>
+          <w:rStyle w:val="VerbatimChar"/>
+        </w:rPr>
+        <w:t xml:space="preserve">.zim</w:t>
+      </w:r>
+      <w:r>
+        <w:t xml:space="preserve"> </w:t>
+      </w:r>
+      <w:r>
+        <w:t xml:space="preserve">files</w:t>
+      </w:r>
+      <w:r>
+        <w:t xml:space="preserve"> </w:t>
+      </w:r>
+      <w:r>
+        <w:rPr>
+          <w:bCs/>
+          <w:b/>
+        </w:rPr>
+        <w:t xml:space="preserve">immediately</w:t>
+      </w:r>
+      <w:r>
+        <w:t xml:space="preserve">, without waiting for the rest of the batch:</w:t>
       </w:r>
     </w:p>
     <w:p>
@@ -3369,16 +3209,7 @@
         <w:rPr>
           <w:rStyle w:val="VerbatimChar"/>
         </w:rPr>
-        <w:t xml:space="preserve"># Format: filename|size_human|size_bytes|url|torrent_url</w:t>
-      </w:r>
-      <w:r>
-        <w:br/>
-      </w:r>
-      <w:r>
-        <w:rPr>
-          <w:rStyle w:val="VerbatimChar"/>
-        </w:rPr>
-        <w:t xml:space="preserve">wikipedia_en_all_maxi_2026-07.zim|115.00 GiB|123456789012|https://...|https://...torrent</w:t>
+        <w:t xml:space="preserve">  Removed old version: gutenberg_en_all_2025-11.zim (freed 206.00 GiB)</w:t>
       </w:r>
     </w:p>
     <w:p>
@@ -3386,25 +3217,23 @@
         <w:pStyle w:val="FirstParagraph"/>
       </w:pPr>
       <w:r>
-        <w:t xml:space="preserve">Both old format (</w:t>
-      </w:r>
-      <w:r>
-        <w:rPr>
-          <w:rStyle w:val="VerbatimChar"/>
-        </w:rPr>
-        <w:t xml:space="preserve">filename|size_bytes|url|torrent_url</w:t>
-      </w:r>
-      <w:r>
-        <w:t xml:space="preserve">) and new format (</w:t>
-      </w:r>
-      <w:r>
-        <w:rPr>
-          <w:rStyle w:val="VerbatimChar"/>
-        </w:rPr>
-        <w:t xml:space="preserve">filename|size_human|size_bytes|url|torrent_url</w:t>
-      </w:r>
-      <w:r>
-        <w:t xml:space="preserve">) are accepted when loading a list.</w:t>
+        <w:t xml:space="preserve">Concurrent downloads (default max 4) each free their own predecessor when they finish. Peak concurrent usage can temporarily exceed the</w:t>
+      </w:r>
+      <w:r>
+        <w:t xml:space="preserve"> </w:t>
+      </w:r>
+      <w:r>
+        <w:rPr>
+          <w:iCs/>
+          <w:i/>
+        </w:rPr>
+        <w:t xml:space="preserve">net</w:t>
+      </w:r>
+      <w:r>
+        <w:t xml:space="preserve"> </w:t>
+      </w:r>
+      <w:r>
+        <w:t xml:space="preserve">figure while several large files are in flight before their old counterparts are removed; the safety buffer and the warning text on the insufficient-space prompt reflect that.</w:t>
       </w:r>
     </w:p>
     <w:p>
@@ -3414,96 +3243,217 @@
         </w:pict>
       </w:r>
     </w:p>
-    <w:bookmarkEnd w:id="35"/>
-    <w:bookmarkEnd w:id="36"/>
-    <w:bookmarkStart w:id="39" w:name="download-methods"/>
+    <w:bookmarkEnd w:id="32"/>
+    <w:bookmarkEnd w:id="33"/>
+    <w:bookmarkStart w:id="37" w:name="non-interactive-mode"/>
     <w:p>
       <w:pPr>
         <w:pStyle w:val="Heading2"/>
       </w:pPr>
       <w:r>
-        <w:t xml:space="preserve">Download Methods</w:t>
-      </w:r>
-    </w:p>
-    <w:bookmarkStart w:id="37" w:name="torrent-preferred"/>
+        <w:t xml:space="preserve">Non-Interactive Update Mode (Cron Jobs)</w:t>
+      </w:r>
+    </w:p>
+    <w:p>
+      <w:pPr>
+        <w:pStyle w:val="FirstParagraph"/>
+      </w:pPr>
+      <w:r>
+        <w:t xml:space="preserve">The script supports a fully non-interactive update mode suitable for automated scheduling via cron or any task scheduler.</w:t>
+      </w:r>
+    </w:p>
+    <w:bookmarkStart w:id="34" w:name="usage"/>
     <w:p>
       <w:pPr>
         <w:pStyle w:val="Heading3"/>
       </w:pPr>
       <w:r>
-        <w:t xml:space="preserve">Torrent (Preferred)</w:t>
-      </w:r>
-    </w:p>
-    <w:p>
-      <w:pPr>
-        <w:pStyle w:val="FirstParagraph"/>
-      </w:pPr>
-      <w:r>
-        <w:t xml:space="preserve">When a</w:t>
-      </w:r>
-      <w:r>
-        <w:t xml:space="preserve"> </w:t>
-      </w:r>
-      <w:r>
-        <w:rPr>
-          <w:rStyle w:val="VerbatimChar"/>
-        </w:rPr>
-        <w:t xml:space="preserve">.torrent</w:t>
-      </w:r>
-      <w:r>
-        <w:t xml:space="preserve"> </w:t>
-      </w:r>
-      <w:r>
-        <w:t xml:space="preserve">file is available on the Kiwix server for a ZIM file, the script downloads via BitTorrent using libtorrent. This is faster and more reliable for large files, as it distributes the load across multiple peers.</w:t>
-      </w:r>
-    </w:p>
-    <w:p>
-      <w:pPr>
-        <w:pStyle w:val="BodyText"/>
-      </w:pPr>
-      <w:r>
-        <w:t xml:space="preserve">The progress display shows status, percentage, speed, and peer counts. Torrent downloads are</w:t>
-      </w:r>
-      <w:r>
-        <w:t xml:space="preserve"> </w:t>
-      </w:r>
+        <w:t xml:space="preserve">Usage</w:t>
+      </w:r>
+    </w:p>
+    <w:p>
+      <w:pPr>
+        <w:pStyle w:val="SourceCode"/>
+      </w:pPr>
+      <w:r>
+        <w:rPr>
+          <w:rStyle w:val="ExtensionTok"/>
+        </w:rPr>
+        <w:t xml:space="preserve">python3</w:t>
+      </w:r>
+      <w:r>
+        <w:rPr>
+          <w:rStyle w:val="NormalTok"/>
+        </w:rPr>
+        <w:t xml:space="preserve"> kiwix_english_best_v20260822b.py </w:t>
+      </w:r>
+      <w:r>
+        <w:rPr>
+          <w:rStyle w:val="AttributeTok"/>
+        </w:rPr>
+        <w:t xml:space="preserve">-u</w:t>
+      </w:r>
+      <w:r>
+        <w:br/>
+      </w:r>
+      <w:r>
+        <w:rPr>
+          <w:rStyle w:val="CommentTok"/>
+        </w:rPr>
+        <w:t xml:space="preserve"># or</w:t>
+      </w:r>
+      <w:r>
+        <w:br/>
+      </w:r>
+      <w:r>
+        <w:rPr>
+          <w:rStyle w:val="ExtensionTok"/>
+        </w:rPr>
+        <w:t xml:space="preserve">python3</w:t>
+      </w:r>
+      <w:r>
+        <w:rPr>
+          <w:rStyle w:val="NormalTok"/>
+        </w:rPr>
+        <w:t xml:space="preserve"> kiwix_english_best_v20260822b.py </w:t>
+      </w:r>
+      <w:r>
+        <w:rPr>
+          <w:rStyle w:val="AttributeTok"/>
+        </w:rPr>
+        <w:t xml:space="preserve">--update</w:t>
+      </w:r>
+    </w:p>
+    <w:bookmarkEnd w:id="34"/>
+    <w:bookmarkStart w:id="35" w:name="behaviour"/>
+    <w:p>
+      <w:pPr>
+        <w:pStyle w:val="Heading3"/>
+      </w:pPr>
+      <w:r>
+        <w:t xml:space="preserve">Behaviour</w:t>
+      </w:r>
+    </w:p>
+    <w:p>
+      <w:pPr>
+        <w:numPr>
+          <w:ilvl w:val="0"/>
+          <w:numId w:val="1010"/>
+        </w:numPr>
+        <w:pStyle w:val="Compact"/>
+      </w:pPr>
       <w:r>
         <w:rPr>
           <w:bCs/>
           <w:b/>
         </w:rPr>
-        <w:t xml:space="preserve">piece-verified</w:t>
-      </w:r>
-      <w:r>
-        <w:t xml:space="preserve"> </w:t>
-      </w:r>
-      <w:r>
-        <w:t xml:space="preserve">by libtorrent, so only a ZIM magic-header check is performed after completion (full</w:t>
-      </w:r>
-      <w:r>
-        <w:t xml:space="preserve"> </w:t>
-      </w:r>
-      <w:r>
-        <w:rPr>
-          <w:rStyle w:val="VerbatimChar"/>
-        </w:rPr>
-        <w:t xml:space="preserve">zimcheck</w:t>
-      </w:r>
-      <w:r>
-        <w:t xml:space="preserve"> </w:t>
-      </w:r>
-      <w:r>
-        <w:t xml:space="preserve">would be redundant and slow).</w:t>
-      </w:r>
-    </w:p>
-    <w:bookmarkEnd w:id="37"/>
-    <w:bookmarkStart w:id="38" w:name="http-fallback"/>
+        <w:t xml:space="preserve">Exits silently</w:t>
+      </w:r>
+      <w:r>
+        <w:t xml:space="preserve"> </w:t>
+      </w:r>
+      <w:r>
+        <w:t xml:space="preserve">(exit code 0) if the</w:t>
+      </w:r>
+      <w:r>
+        <w:t xml:space="preserve"> </w:t>
+      </w:r>
+      <w:r>
+        <w:rPr>
+          <w:rStyle w:val="VerbatimChar"/>
+        </w:rPr>
+        <w:t xml:space="preserve">zims/</w:t>
+      </w:r>
+      <w:r>
+        <w:t xml:space="preserve"> </w:t>
+      </w:r>
+      <w:r>
+        <w:t xml:space="preserve">directory does not exist — this prevents cron from sending failure emails when the storage volume is not mounted (e.g. VeraCrypt volume not unlocked)</w:t>
+      </w:r>
+    </w:p>
+    <w:p>
+      <w:pPr>
+        <w:numPr>
+          <w:ilvl w:val="0"/>
+          <w:numId w:val="1010"/>
+        </w:numPr>
+        <w:pStyle w:val="Compact"/>
+      </w:pPr>
+      <w:r>
+        <w:t xml:space="preserve">If</w:t>
+      </w:r>
+      <w:r>
+        <w:t xml:space="preserve"> </w:t>
+      </w:r>
+      <w:r>
+        <w:rPr>
+          <w:rStyle w:val="VerbatimChar"/>
+        </w:rPr>
+        <w:t xml:space="preserve">kiwix_resume_update.txt</w:t>
+      </w:r>
+      <w:r>
+        <w:t xml:space="preserve"> </w:t>
+      </w:r>
+      <w:r>
+        <w:t xml:space="preserve">exists, resumes the incomplete session</w:t>
+      </w:r>
+    </w:p>
+    <w:p>
+      <w:pPr>
+        <w:numPr>
+          <w:ilvl w:val="0"/>
+          <w:numId w:val="1010"/>
+        </w:numPr>
+        <w:pStyle w:val="Compact"/>
+      </w:pPr>
+      <w:r>
+        <w:t xml:space="preserve">Otherwise crawls the server and downloads all updates and new groups</w:t>
+      </w:r>
+    </w:p>
+    <w:p>
+      <w:pPr>
+        <w:numPr>
+          <w:ilvl w:val="0"/>
+          <w:numId w:val="1010"/>
+        </w:numPr>
+        <w:pStyle w:val="Compact"/>
+      </w:pPr>
+      <w:r>
+        <w:t xml:space="preserve">Applies the same reclaimable-space calculation and immediate per-file cleanup as interactive mode</w:t>
+      </w:r>
+    </w:p>
+    <w:p>
+      <w:pPr>
+        <w:numPr>
+          <w:ilvl w:val="0"/>
+          <w:numId w:val="1010"/>
+        </w:numPr>
+        <w:pStyle w:val="Compact"/>
+      </w:pPr>
+      <w:r>
+        <w:t xml:space="preserve">Non-verbose output (clean for log files)</w:t>
+      </w:r>
+    </w:p>
+    <w:p>
+      <w:pPr>
+        <w:numPr>
+          <w:ilvl w:val="0"/>
+          <w:numId w:val="1010"/>
+        </w:numPr>
+        <w:pStyle w:val="Compact"/>
+      </w:pPr>
+      <w:r>
+        <w:t xml:space="preserve">Exits with code 1 if there is insufficient disk space or the server crawl fails</w:t>
+      </w:r>
+    </w:p>
+    <w:bookmarkEnd w:id="35"/>
+    <w:bookmarkStart w:id="36" w:name="example-cron-entry"/>
     <w:p>
       <w:pPr>
         <w:pStyle w:val="Heading3"/>
       </w:pPr>
       <w:r>
-        <w:t xml:space="preserve">HTTP (Fallback)</w:t>
+        <w:t xml:space="preserve">Example Cron Entry</w:t>
       </w:r>
     </w:p>
     <w:p>
@@ -3511,31 +3461,108 @@
         <w:pStyle w:val="FirstParagraph"/>
       </w:pPr>
       <w:r>
-        <w:t xml:space="preserve">If no torrent is available, or if the torrent download fails, the script falls back to direct HTTP download from the configured mirrors. Resume is supported via HTTP Range requests — interrupted downloads pick up from the byte offset already on disk.</w:t>
-      </w:r>
-    </w:p>
-    <w:p>
-      <w:pPr>
-        <w:pStyle w:val="BodyText"/>
-      </w:pPr>
-      <w:r>
-        <w:t xml:space="preserve">Default concurrency is</w:t>
-      </w:r>
-      <w:r>
-        <w:t xml:space="preserve"> </w:t>
-      </w:r>
+        <w:t xml:space="preserve">To run every Sunday at 3:00 AM and log output:</w:t>
+      </w:r>
+    </w:p>
+    <w:p>
+      <w:pPr>
+        <w:pStyle w:val="SourceCode"/>
+      </w:pPr>
+      <w:r>
+        <w:rPr>
+          <w:rStyle w:val="ExtensionTok"/>
+        </w:rPr>
+        <w:t xml:space="preserve">0</w:t>
+      </w:r>
+      <w:r>
+        <w:rPr>
+          <w:rStyle w:val="NormalTok"/>
+        </w:rPr>
+        <w:t xml:space="preserve"> 3 </w:t>
+      </w:r>
+      <w:r>
+        <w:rPr>
+          <w:rStyle w:val="PreprocessorTok"/>
+        </w:rPr>
+        <w:t xml:space="preserve">*</w:t>
+      </w:r>
+      <w:r>
+        <w:rPr>
+          <w:rStyle w:val="NormalTok"/>
+        </w:rPr>
+        <w:t xml:space="preserve"> </w:t>
+      </w:r>
+      <w:r>
+        <w:rPr>
+          <w:rStyle w:val="PreprocessorTok"/>
+        </w:rPr>
+        <w:t xml:space="preserve">*</w:t>
+      </w:r>
+      <w:r>
+        <w:rPr>
+          <w:rStyle w:val="NormalTok"/>
+        </w:rPr>
+        <w:t xml:space="preserve"> 0  python3 /path/to/kiwix_english_best_v20260822b.py </w:t>
+      </w:r>
+      <w:r>
+        <w:rPr>
+          <w:rStyle w:val="AttributeTok"/>
+        </w:rPr>
+        <w:t xml:space="preserve">-u</w:t>
+      </w:r>
+      <w:r>
+        <w:rPr>
+          <w:rStyle w:val="NormalTok"/>
+        </w:rPr>
+        <w:t xml:space="preserve"> </w:t>
+      </w:r>
+      <w:r>
+        <w:rPr>
+          <w:rStyle w:val="OperatorTok"/>
+        </w:rPr>
+        <w:t xml:space="preserve">&gt;&gt;</w:t>
+      </w:r>
+      <w:r>
+        <w:rPr>
+          <w:rStyle w:val="NormalTok"/>
+        </w:rPr>
+        <w:t xml:space="preserve"> /path/to/kiwix_cron.log </w:t>
+      </w:r>
+      <w:r>
+        <w:rPr>
+          <w:rStyle w:val="DecValTok"/>
+        </w:rPr>
+        <w:t xml:space="preserve">2</w:t>
+      </w:r>
+      <w:r>
+        <w:rPr>
+          <w:rStyle w:val="OperatorTok"/>
+        </w:rPr>
+        <w:t xml:space="preserve">&gt;&amp;</w:t>
+      </w:r>
+      <w:r>
+        <w:rPr>
+          <w:rStyle w:val="DecValTok"/>
+        </w:rPr>
+        <w:t xml:space="preserve">1</w:t>
+      </w:r>
+    </w:p>
+    <w:p>
+      <w:pPr>
+        <w:pStyle w:val="FirstParagraph"/>
+      </w:pPr>
       <w:r>
         <w:rPr>
           <w:bCs/>
           <w:b/>
         </w:rPr>
-        <w:t xml:space="preserve">4</w:t>
-      </w:r>
-      <w:r>
-        <w:t xml:space="preserve"> </w:t>
-      </w:r>
-      <w:r>
-        <w:t xml:space="preserve">parallel downloads. Space checks include a safety buffer (default 10 GiB, or 10% of remaining required size, whichever is larger).</w:t>
+        <w:t xml:space="preserve">Important:</w:t>
+      </w:r>
+      <w:r>
+        <w:t xml:space="preserve"> </w:t>
+      </w:r>
+      <w:r>
+        <w:t xml:space="preserve">If your ZIM files are on an encrypted volume (e.g. VeraCrypt), the volume must already be mounted when the cron job runs. The script will exit gracefully if it is not.</w:t>
       </w:r>
     </w:p>
     <w:p>
@@ -3545,135 +3572,15 @@
         </w:pict>
       </w:r>
     </w:p>
-    <w:bookmarkEnd w:id="38"/>
-    <w:bookmarkEnd w:id="39"/>
-    <w:bookmarkStart w:id="43" w:name="progress-display"/>
+    <w:bookmarkEnd w:id="36"/>
+    <w:bookmarkEnd w:id="37"/>
+    <w:bookmarkStart w:id="39" w:name="file-reference"/>
     <w:p>
       <w:pPr>
         <w:pStyle w:val="Heading2"/>
       </w:pPr>
       <w:r>
-        <w:t xml:space="preserve">Progress Display</w:t>
-      </w:r>
-    </w:p>
-    <w:bookmarkStart w:id="40" w:name="verbose-mode"/>
-    <w:p>
-      <w:pPr>
-        <w:pStyle w:val="Heading3"/>
-      </w:pPr>
-      <w:r>
-        <w:t xml:space="preserve">Verbose Mode</w:t>
-      </w:r>
-    </w:p>
-    <w:p>
-      <w:pPr>
-        <w:pStyle w:val="FirstParagraph"/>
-      </w:pPr>
-      <w:r>
-        <w:t xml:space="preserve">Each active download gets its own status line. A total progress bar tracks cumulative bytes downloaded versus the session total, with a byte-based ETA:</w:t>
-      </w:r>
-    </w:p>
-    <w:p>
-      <w:pPr>
-        <w:pStyle w:val="SourceCode"/>
-      </w:pPr>
-      <w:r>
-        <w:rPr>
-          <w:rStyle w:val="VerbatimChar"/>
-        </w:rPr>
-        <w:t xml:space="preserve">gutenberg_en_all_2025-11.zim - downloading | 12.4% | 5.2 MB/s | Peers: 11</w:t>
-      </w:r>
-      <w:r>
-        <w:br/>
-      </w:r>
-      <w:r>
-        <w:rPr>
-          <w:rStyle w:val="VerbatimChar"/>
-        </w:rPr>
-        <w:t xml:space="preserve">khanacademy_en_all_2023-03.zim - downloading | 3.1% | 2.1 MB/s | Peers: 8</w:t>
-      </w:r>
-      <w:r>
-        <w:br/>
-      </w:r>
-      <w:r>
-        <w:rPr>
-          <w:rStyle w:val="VerbatimChar"/>
-        </w:rPr>
-        <w:t xml:space="preserve">Total progress:  4%|▍ | 24.5G/609G [00:12:41, 780MB/s, ETA=01:15:22]</w:t>
-      </w:r>
-    </w:p>
-    <w:bookmarkEnd w:id="40"/>
-    <w:bookmarkStart w:id="41" w:name="non-verbose-mode"/>
-    <w:p>
-      <w:pPr>
-        <w:pStyle w:val="Heading3"/>
-      </w:pPr>
-      <w:r>
-        <w:t xml:space="preserve">Non-Verbose Mode</w:t>
-      </w:r>
-    </w:p>
-    <w:p>
-      <w:pPr>
-        <w:pStyle w:val="FirstParagraph"/>
-      </w:pPr>
-      <w:r>
-        <w:t xml:space="preserve">A single updating block shows active files plus the total bar, rewritten in place without scrolling.</w:t>
-      </w:r>
-    </w:p>
-    <w:bookmarkEnd w:id="41"/>
-    <w:bookmarkStart w:id="42" w:name="post-run-summary"/>
-    <w:p>
-      <w:pPr>
-        <w:pStyle w:val="Heading3"/>
-      </w:pPr>
-      <w:r>
-        <w:t xml:space="preserve">Post-Run Summary</w:t>
-      </w:r>
-    </w:p>
-    <w:p>
-      <w:pPr>
-        <w:pStyle w:val="FirstParagraph"/>
-      </w:pPr>
-      <w:r>
-        <w:t xml:space="preserve">After every download session, a summary is printed with good / corrupt counts and total disk usage under</w:t>
-      </w:r>
-      <w:r>
-        <w:t xml:space="preserve"> </w:t>
-      </w:r>
-      <w:r>
-        <w:rPr>
-          <w:rStyle w:val="VerbatimChar"/>
-        </w:rPr>
-        <w:t xml:space="preserve">./zims/</w:t>
-      </w:r>
-      <w:r>
-        <w:t xml:space="preserve">. Incomplete files (if any) are listed with bytes on disk and bytes remaining, plus a pointer to the appropriate resume option.</w:t>
-      </w:r>
-    </w:p>
-    <w:p>
-      <w:r>
-        <w:pict>
-          <v:rect style="width:0;height:1.5pt" o:hralign="center" o:hrstd="t" o:hr="t"/>
-        </w:pict>
-      </w:r>
-    </w:p>
-    <w:bookmarkEnd w:id="42"/>
-    <w:bookmarkEnd w:id="43"/>
-    <w:bookmarkStart w:id="44" w:name="integrity-verification"/>
-    <w:p>
-      <w:pPr>
-        <w:pStyle w:val="Heading2"/>
-      </w:pPr>
-      <w:r>
-        <w:t xml:space="preserve">Integrity Verification</w:t>
-      </w:r>
-    </w:p>
-    <w:p>
-      <w:pPr>
-        <w:pStyle w:val="FirstParagraph"/>
-      </w:pPr>
-      <w:r>
-        <w:t xml:space="preserve">After every successful download, the file is verified before being counted as complete:</w:t>
+        <w:t xml:space="preserve">File Reference</w:t>
       </w:r>
     </w:p>
     <w:tbl>
@@ -3699,6 +3606,654 @@
               <w:jc w:val="left"/>
             </w:pPr>
             <w:r>
+              <w:t xml:space="preserve">File</w:t>
+            </w:r>
+          </w:p>
+        </w:tc>
+        <w:tc>
+          <w:tcPr/>
+          <w:p>
+            <w:pPr>
+              <w:pStyle w:val="Compact"/>
+              <w:jc w:val="left"/>
+            </w:pPr>
+            <w:r>
+              <w:t xml:space="preserve">Description</w:t>
+            </w:r>
+          </w:p>
+        </w:tc>
+      </w:tr>
+      <w:tr>
+        <w:tc>
+          <w:tcPr/>
+          <w:p>
+            <w:pPr>
+              <w:pStyle w:val="Compact"/>
+              <w:jc w:val="left"/>
+            </w:pPr>
+            <w:r>
+              <w:rPr>
+                <w:rStyle w:val="VerbatimChar"/>
+              </w:rPr>
+              <w:t xml:space="preserve">zims/</w:t>
+            </w:r>
+          </w:p>
+        </w:tc>
+        <w:tc>
+          <w:tcPr/>
+          <w:p>
+            <w:pPr>
+              <w:pStyle w:val="Compact"/>
+              <w:jc w:val="left"/>
+            </w:pPr>
+            <w:r>
+              <w:t xml:space="preserve">Directory where all ZIM files are stored</w:t>
+            </w:r>
+          </w:p>
+        </w:tc>
+      </w:tr>
+      <w:tr>
+        <w:tc>
+          <w:tcPr/>
+          <w:p>
+            <w:pPr>
+              <w:pStyle w:val="Compact"/>
+              <w:jc w:val="left"/>
+            </w:pPr>
+            <w:r>
+              <w:rPr>
+                <w:rStyle w:val="VerbatimChar"/>
+              </w:rPr>
+              <w:t xml:space="preserve">zims/*.zim</w:t>
+            </w:r>
+          </w:p>
+        </w:tc>
+        <w:tc>
+          <w:tcPr/>
+          <w:p>
+            <w:pPr>
+              <w:pStyle w:val="Compact"/>
+              <w:jc w:val="left"/>
+            </w:pPr>
+            <w:r>
+              <w:t xml:space="preserve">Completed, verified ZIM files</w:t>
+            </w:r>
+          </w:p>
+        </w:tc>
+      </w:tr>
+      <w:tr>
+        <w:tc>
+          <w:tcPr/>
+          <w:p>
+            <w:pPr>
+              <w:pStyle w:val="Compact"/>
+              <w:jc w:val="left"/>
+            </w:pPr>
+            <w:r>
+              <w:rPr>
+                <w:rStyle w:val="VerbatimChar"/>
+              </w:rPr>
+              <w:t xml:space="preserve">zims/*.zim.partial</w:t>
+            </w:r>
+          </w:p>
+        </w:tc>
+        <w:tc>
+          <w:tcPr/>
+          <w:p>
+            <w:pPr>
+              <w:pStyle w:val="Compact"/>
+              <w:jc w:val="left"/>
+            </w:pPr>
+            <w:r>
+              <w:t xml:space="preserve">Incomplete downloads — safe to leave in place; will be resumed automatically</w:t>
+            </w:r>
+          </w:p>
+        </w:tc>
+      </w:tr>
+      <w:tr>
+        <w:tc>
+          <w:tcPr/>
+          <w:p>
+            <w:pPr>
+              <w:pStyle w:val="Compact"/>
+              <w:jc w:val="left"/>
+            </w:pPr>
+            <w:r>
+              <w:rPr>
+                <w:rStyle w:val="VerbatimChar"/>
+              </w:rPr>
+              <w:t xml:space="preserve">zims/*.zim.fastresume</w:t>
+            </w:r>
+          </w:p>
+        </w:tc>
+        <w:tc>
+          <w:tcPr/>
+          <w:p>
+            <w:pPr>
+              <w:pStyle w:val="Compact"/>
+              <w:jc w:val="left"/>
+            </w:pPr>
+            <w:r>
+              <w:t xml:space="preserve">Torrent resume data — deleted automatically on completion</w:t>
+            </w:r>
+          </w:p>
+        </w:tc>
+      </w:tr>
+      <w:tr>
+        <w:tc>
+          <w:tcPr/>
+          <w:p>
+            <w:pPr>
+              <w:pStyle w:val="Compact"/>
+              <w:jc w:val="left"/>
+            </w:pPr>
+            <w:r>
+              <w:rPr>
+                <w:rStyle w:val="VerbatimChar"/>
+              </w:rPr>
+              <w:t xml:space="preserve">zims/corrupt/</w:t>
+            </w:r>
+          </w:p>
+        </w:tc>
+        <w:tc>
+          <w:tcPr/>
+          <w:p>
+            <w:pPr>
+              <w:pStyle w:val="Compact"/>
+              <w:jc w:val="left"/>
+            </w:pPr>
+            <w:r>
+              <w:t xml:space="preserve">Files that failed integrity verification</w:t>
+            </w:r>
+          </w:p>
+        </w:tc>
+      </w:tr>
+      <w:tr>
+        <w:tc>
+          <w:tcPr/>
+          <w:p>
+            <w:pPr>
+              <w:pStyle w:val="Compact"/>
+              <w:jc w:val="left"/>
+            </w:pPr>
+            <w:r>
+              <w:rPr>
+                <w:rStyle w:val="VerbatimChar"/>
+              </w:rPr>
+              <w:t xml:space="preserve">kiwix_english_best.txt</w:t>
+            </w:r>
+          </w:p>
+        </w:tc>
+        <w:tc>
+          <w:tcPr/>
+          <w:p>
+            <w:pPr>
+              <w:pStyle w:val="Compact"/>
+              <w:jc w:val="left"/>
+            </w:pPr>
+            <w:r>
+              <w:t xml:space="preserve">Full best-file list generated by Option 1</w:t>
+            </w:r>
+          </w:p>
+        </w:tc>
+      </w:tr>
+      <w:tr>
+        <w:tc>
+          <w:tcPr/>
+          <w:p>
+            <w:pPr>
+              <w:pStyle w:val="Compact"/>
+              <w:jc w:val="left"/>
+            </w:pPr>
+            <w:r>
+              <w:rPr>
+                <w:rStyle w:val="VerbatimChar"/>
+              </w:rPr>
+              <w:t xml:space="preserve">kiwix_resume_update.txt</w:t>
+            </w:r>
+          </w:p>
+        </w:tc>
+        <w:tc>
+          <w:tcPr/>
+          <w:p>
+            <w:pPr>
+              <w:pStyle w:val="Compact"/>
+              <w:jc w:val="left"/>
+            </w:pPr>
+            <w:r>
+              <w:t xml:space="preserve">Incomplete update session resume file — written by Option 3, deleted on full completion</w:t>
+            </w:r>
+          </w:p>
+        </w:tc>
+      </w:tr>
+      <w:tr>
+        <w:tc>
+          <w:tcPr/>
+          <w:p>
+            <w:pPr>
+              <w:pStyle w:val="Compact"/>
+              <w:jc w:val="left"/>
+            </w:pPr>
+            <w:r>
+              <w:rPr>
+                <w:rStyle w:val="VerbatimChar"/>
+              </w:rPr>
+              <w:t xml:space="preserve">kiwix_download_failures.log</w:t>
+            </w:r>
+          </w:p>
+        </w:tc>
+        <w:tc>
+          <w:tcPr/>
+          <w:p>
+            <w:pPr>
+              <w:pStyle w:val="Compact"/>
+              <w:jc w:val="left"/>
+            </w:pPr>
+            <w:r>
+              <w:t xml:space="preserve">Log of all download failures with timestamps and error details</w:t>
+            </w:r>
+          </w:p>
+        </w:tc>
+      </w:tr>
+    </w:tbl>
+    <w:bookmarkStart w:id="38" w:name="list-file-format"/>
+    <w:p>
+      <w:pPr>
+        <w:pStyle w:val="Heading3"/>
+      </w:pPr>
+      <w:r>
+        <w:t xml:space="preserve">List File Format</w:t>
+      </w:r>
+    </w:p>
+    <w:p>
+      <w:pPr>
+        <w:pStyle w:val="FirstParagraph"/>
+      </w:pPr>
+      <w:r>
+        <w:rPr>
+          <w:rStyle w:val="VerbatimChar"/>
+        </w:rPr>
+        <w:t xml:space="preserve">kiwix_english_best.txt</w:t>
+      </w:r>
+      <w:r>
+        <w:t xml:space="preserve"> </w:t>
+      </w:r>
+      <w:r>
+        <w:t xml:space="preserve">and</w:t>
+      </w:r>
+      <w:r>
+        <w:t xml:space="preserve"> </w:t>
+      </w:r>
+      <w:r>
+        <w:rPr>
+          <w:rStyle w:val="VerbatimChar"/>
+        </w:rPr>
+        <w:t xml:space="preserve">kiwix_resume_update.txt</w:t>
+      </w:r>
+      <w:r>
+        <w:t xml:space="preserve"> </w:t>
+      </w:r>
+      <w:r>
+        <w:t xml:space="preserve">use a pipe-delimited format:</w:t>
+      </w:r>
+    </w:p>
+    <w:p>
+      <w:pPr>
+        <w:pStyle w:val="SourceCode"/>
+      </w:pPr>
+      <w:r>
+        <w:rPr>
+          <w:rStyle w:val="VerbatimChar"/>
+        </w:rPr>
+        <w:t xml:space="preserve"># Format: filename|size_human|size_bytes|url|torrent_url</w:t>
+      </w:r>
+      <w:r>
+        <w:br/>
+      </w:r>
+      <w:r>
+        <w:rPr>
+          <w:rStyle w:val="VerbatimChar"/>
+        </w:rPr>
+        <w:t xml:space="preserve">wikipedia_en_all_maxi_2026-07.zim|115.00 GiB|123456789012|https://...|https://...torrent</w:t>
+      </w:r>
+    </w:p>
+    <w:p>
+      <w:pPr>
+        <w:pStyle w:val="FirstParagraph"/>
+      </w:pPr>
+      <w:r>
+        <w:t xml:space="preserve">Both old format (</w:t>
+      </w:r>
+      <w:r>
+        <w:rPr>
+          <w:rStyle w:val="VerbatimChar"/>
+        </w:rPr>
+        <w:t xml:space="preserve">filename|size_bytes|url|torrent_url</w:t>
+      </w:r>
+      <w:r>
+        <w:t xml:space="preserve">) and new format (</w:t>
+      </w:r>
+      <w:r>
+        <w:rPr>
+          <w:rStyle w:val="VerbatimChar"/>
+        </w:rPr>
+        <w:t xml:space="preserve">filename|size_human|size_bytes|url|torrent_url</w:t>
+      </w:r>
+      <w:r>
+        <w:t xml:space="preserve">) are accepted when loading a list.</w:t>
+      </w:r>
+    </w:p>
+    <w:p>
+      <w:r>
+        <w:pict>
+          <v:rect style="width:0;height:1.5pt" o:hralign="center" o:hrstd="t" o:hr="t"/>
+        </w:pict>
+      </w:r>
+    </w:p>
+    <w:bookmarkEnd w:id="38"/>
+    <w:bookmarkEnd w:id="39"/>
+    <w:bookmarkStart w:id="42" w:name="download-methods"/>
+    <w:p>
+      <w:pPr>
+        <w:pStyle w:val="Heading2"/>
+      </w:pPr>
+      <w:r>
+        <w:t xml:space="preserve">Download Methods</w:t>
+      </w:r>
+    </w:p>
+    <w:bookmarkStart w:id="40" w:name="torrent-preferred"/>
+    <w:p>
+      <w:pPr>
+        <w:pStyle w:val="Heading3"/>
+      </w:pPr>
+      <w:r>
+        <w:t xml:space="preserve">Torrent (Preferred)</w:t>
+      </w:r>
+    </w:p>
+    <w:p>
+      <w:pPr>
+        <w:pStyle w:val="FirstParagraph"/>
+      </w:pPr>
+      <w:r>
+        <w:t xml:space="preserve">When a</w:t>
+      </w:r>
+      <w:r>
+        <w:t xml:space="preserve"> </w:t>
+      </w:r>
+      <w:r>
+        <w:rPr>
+          <w:rStyle w:val="VerbatimChar"/>
+        </w:rPr>
+        <w:t xml:space="preserve">.torrent</w:t>
+      </w:r>
+      <w:r>
+        <w:t xml:space="preserve"> </w:t>
+      </w:r>
+      <w:r>
+        <w:t xml:space="preserve">file is available on the Kiwix server for a ZIM file, the script downloads via BitTorrent using libtorrent. This is faster and more reliable for large files, as it distributes the load across multiple peers.</w:t>
+      </w:r>
+    </w:p>
+    <w:p>
+      <w:pPr>
+        <w:pStyle w:val="BodyText"/>
+      </w:pPr>
+      <w:r>
+        <w:t xml:space="preserve">The progress display shows status, percentage, speed, and peer counts. Torrent downloads are</w:t>
+      </w:r>
+      <w:r>
+        <w:t xml:space="preserve"> </w:t>
+      </w:r>
+      <w:r>
+        <w:rPr>
+          <w:bCs/>
+          <w:b/>
+        </w:rPr>
+        <w:t xml:space="preserve">piece-verified</w:t>
+      </w:r>
+      <w:r>
+        <w:t xml:space="preserve"> </w:t>
+      </w:r>
+      <w:r>
+        <w:t xml:space="preserve">by libtorrent, so only a ZIM magic-header check is performed after completion (full</w:t>
+      </w:r>
+      <w:r>
+        <w:t xml:space="preserve"> </w:t>
+      </w:r>
+      <w:r>
+        <w:rPr>
+          <w:rStyle w:val="VerbatimChar"/>
+        </w:rPr>
+        <w:t xml:space="preserve">zimcheck</w:t>
+      </w:r>
+      <w:r>
+        <w:t xml:space="preserve"> </w:t>
+      </w:r>
+      <w:r>
+        <w:t xml:space="preserve">would be redundant and slow).</w:t>
+      </w:r>
+    </w:p>
+    <w:bookmarkEnd w:id="40"/>
+    <w:bookmarkStart w:id="41" w:name="http-fallback"/>
+    <w:p>
+      <w:pPr>
+        <w:pStyle w:val="Heading3"/>
+      </w:pPr>
+      <w:r>
+        <w:t xml:space="preserve">HTTP (Fallback)</w:t>
+      </w:r>
+    </w:p>
+    <w:p>
+      <w:pPr>
+        <w:pStyle w:val="FirstParagraph"/>
+      </w:pPr>
+      <w:r>
+        <w:t xml:space="preserve">If no torrent is available, or if the torrent download fails, the script falls back to direct HTTP download from the configured mirrors. Resume is supported via HTTP Range requests — interrupted downloads pick up from the byte offset already on disk.</w:t>
+      </w:r>
+    </w:p>
+    <w:p>
+      <w:pPr>
+        <w:pStyle w:val="BodyText"/>
+      </w:pPr>
+      <w:r>
+        <w:t xml:space="preserve">Default concurrency is</w:t>
+      </w:r>
+      <w:r>
+        <w:t xml:space="preserve"> </w:t>
+      </w:r>
+      <w:r>
+        <w:rPr>
+          <w:bCs/>
+          <w:b/>
+        </w:rPr>
+        <w:t xml:space="preserve">4</w:t>
+      </w:r>
+      <w:r>
+        <w:t xml:space="preserve"> </w:t>
+      </w:r>
+      <w:r>
+        <w:t xml:space="preserve">parallel downloads. Space checks use the net-after-reclaim figure plus a safety buffer (default 10 GiB, or 10% of net, whichever is larger).</w:t>
+      </w:r>
+    </w:p>
+    <w:p>
+      <w:r>
+        <w:pict>
+          <v:rect style="width:0;height:1.5pt" o:hralign="center" o:hrstd="t" o:hr="t"/>
+        </w:pict>
+      </w:r>
+    </w:p>
+    <w:bookmarkEnd w:id="41"/>
+    <w:bookmarkEnd w:id="42"/>
+    <w:bookmarkStart w:id="46" w:name="progress-display"/>
+    <w:p>
+      <w:pPr>
+        <w:pStyle w:val="Heading2"/>
+      </w:pPr>
+      <w:r>
+        <w:t xml:space="preserve">Progress Display</w:t>
+      </w:r>
+    </w:p>
+    <w:bookmarkStart w:id="43" w:name="verbose-mode"/>
+    <w:p>
+      <w:pPr>
+        <w:pStyle w:val="Heading3"/>
+      </w:pPr>
+      <w:r>
+        <w:t xml:space="preserve">Verbose Mode</w:t>
+      </w:r>
+    </w:p>
+    <w:p>
+      <w:pPr>
+        <w:pStyle w:val="FirstParagraph"/>
+      </w:pPr>
+      <w:r>
+        <w:t xml:space="preserve">Each active download gets its own status line. A total progress bar tracks cumulative bytes downloaded versus the session total, with a byte-based ETA:</w:t>
+      </w:r>
+    </w:p>
+    <w:p>
+      <w:pPr>
+        <w:pStyle w:val="SourceCode"/>
+      </w:pPr>
+      <w:r>
+        <w:rPr>
+          <w:rStyle w:val="VerbatimChar"/>
+        </w:rPr>
+        <w:t xml:space="preserve">gutenberg_en_all_2026-03.zim - downloading | 12.4% | 5.2 MB/s | Peers: 11</w:t>
+      </w:r>
+      <w:r>
+        <w:br/>
+      </w:r>
+      <w:r>
+        <w:rPr>
+          <w:rStyle w:val="VerbatimChar"/>
+        </w:rPr>
+        <w:t xml:space="preserve">khanacademy_en_all_2023-03.zim - downloading | 3.1% | 2.1 MB/s | Peers: 8</w:t>
+      </w:r>
+      <w:r>
+        <w:br/>
+      </w:r>
+      <w:r>
+        <w:rPr>
+          <w:rStyle w:val="VerbatimChar"/>
+        </w:rPr>
+        <w:t xml:space="preserve">Total progress:  4%|▍ | 24.5G/609G [00:12:41, 780MB/s, ETA=01:15:22]</w:t>
+      </w:r>
+    </w:p>
+    <w:p>
+      <w:pPr>
+        <w:pStyle w:val="FirstParagraph"/>
+      </w:pPr>
+      <w:r>
+        <w:t xml:space="preserve">When an update finishes, you may also see:</w:t>
+      </w:r>
+    </w:p>
+    <w:p>
+      <w:pPr>
+        <w:pStyle w:val="SourceCode"/>
+      </w:pPr>
+      <w:r>
+        <w:rPr>
+          <w:rStyle w:val="VerbatimChar"/>
+        </w:rPr>
+        <w:t xml:space="preserve">  Removed old version: gutenberg_en_all_2025-11.zim (freed 206.00 GiB)</w:t>
+      </w:r>
+    </w:p>
+    <w:bookmarkEnd w:id="43"/>
+    <w:bookmarkStart w:id="44" w:name="non-verbose-mode"/>
+    <w:p>
+      <w:pPr>
+        <w:pStyle w:val="Heading3"/>
+      </w:pPr>
+      <w:r>
+        <w:t xml:space="preserve">Non-Verbose Mode</w:t>
+      </w:r>
+    </w:p>
+    <w:p>
+      <w:pPr>
+        <w:pStyle w:val="FirstParagraph"/>
+      </w:pPr>
+      <w:r>
+        <w:t xml:space="preserve">A single updating block shows active files plus the total bar, rewritten in place without scrolling.</w:t>
+      </w:r>
+    </w:p>
+    <w:bookmarkEnd w:id="44"/>
+    <w:bookmarkStart w:id="45" w:name="post-run-summary"/>
+    <w:p>
+      <w:pPr>
+        <w:pStyle w:val="Heading3"/>
+      </w:pPr>
+      <w:r>
+        <w:t xml:space="preserve">Post-Run Summary</w:t>
+      </w:r>
+    </w:p>
+    <w:p>
+      <w:pPr>
+        <w:pStyle w:val="FirstParagraph"/>
+      </w:pPr>
+      <w:r>
+        <w:t xml:space="preserve">After every download session, a summary is printed with good / corrupt counts and total disk usage under</w:t>
+      </w:r>
+      <w:r>
+        <w:t xml:space="preserve"> </w:t>
+      </w:r>
+      <w:r>
+        <w:rPr>
+          <w:rStyle w:val="VerbatimChar"/>
+        </w:rPr>
+        <w:t xml:space="preserve">./zims/</w:t>
+      </w:r>
+      <w:r>
+        <w:t xml:space="preserve">. Incomplete files (if any) are listed with bytes on disk and bytes remaining, plus a pointer to the appropriate resume option.</w:t>
+      </w:r>
+    </w:p>
+    <w:p>
+      <w:r>
+        <w:pict>
+          <v:rect style="width:0;height:1.5pt" o:hralign="center" o:hrstd="t" o:hr="t"/>
+        </w:pict>
+      </w:r>
+    </w:p>
+    <w:bookmarkEnd w:id="45"/>
+    <w:bookmarkEnd w:id="46"/>
+    <w:bookmarkStart w:id="47" w:name="integrity-verification"/>
+    <w:p>
+      <w:pPr>
+        <w:pStyle w:val="Heading2"/>
+      </w:pPr>
+      <w:r>
+        <w:t xml:space="preserve">Integrity Verification</w:t>
+      </w:r>
+    </w:p>
+    <w:p>
+      <w:pPr>
+        <w:pStyle w:val="FirstParagraph"/>
+      </w:pPr>
+      <w:r>
+        <w:t xml:space="preserve">After every successful download, the file is verified before being counted as complete (and before any old version is deleted):</w:t>
+      </w:r>
+    </w:p>
+    <w:tbl>
+      <w:tblPr>
+        <w:tblStyle w:val="Table"/>
+        <w:tblW w:type="pct" w:w="5000"/>
+        <w:tblLook w:firstRow="1" w:lastRow="0" w:firstColumn="0" w:lastColumn="0" w:noHBand="0" w:noVBand="0" w:val="0020"/>
+        <w:jc w:val="start"/>
+      </w:tblPr>
+      <w:tblGrid>
+        <w:gridCol w:w="3960"/>
+        <w:gridCol w:w="3960"/>
+      </w:tblGrid>
+      <w:tr>
+        <w:trPr>
+          <w:tblHeader w:val="true"/>
+        </w:trPr>
+        <w:tc>
+          <w:tcPr/>
+          <w:p>
+            <w:pPr>
+              <w:pStyle w:val="Compact"/>
+              <w:jc w:val="left"/>
+            </w:pPr>
+            <w:r>
               <w:t xml:space="preserve">Download Method</w:t>
             </w:r>
           </w:p>
@@ -3908,7 +4463,23 @@
         <w:t xml:space="preserve">kiwix_download_failures.log</w:t>
       </w:r>
       <w:r>
-        <w:t xml:space="preserve">.</w:t>
+        <w:t xml:space="preserve">. Failed downloads do</w:t>
+      </w:r>
+      <w:r>
+        <w:t xml:space="preserve"> </w:t>
+      </w:r>
+      <w:r>
+        <w:rPr>
+          <w:bCs/>
+          <w:b/>
+        </w:rPr>
+        <w:t xml:space="preserve">not</w:t>
+      </w:r>
+      <w:r>
+        <w:t xml:space="preserve"> </w:t>
+      </w:r>
+      <w:r>
+        <w:t xml:space="preserve">trigger deletion of the previous good version.</w:t>
       </w:r>
     </w:p>
     <w:p>
@@ -3918,8 +4489,8 @@
         </w:pict>
       </w:r>
     </w:p>
-    <w:bookmarkEnd w:id="44"/>
-    <w:bookmarkStart w:id="45" w:name="server-layout-note-august-2026"/>
+    <w:bookmarkEnd w:id="47"/>
+    <w:bookmarkStart w:id="48" w:name="server-layout-note-august-2026"/>
     <w:p>
       <w:pPr>
         <w:pStyle w:val="Heading2"/>
@@ -4121,8 +4692,8 @@
         </w:pict>
       </w:r>
     </w:p>
-    <w:bookmarkEnd w:id="45"/>
-    <w:bookmarkStart w:id="54" w:name="tips-and-troubleshooting"/>
+    <w:bookmarkEnd w:id="48"/>
+    <w:bookmarkStart w:id="58" w:name="tips-and-troubleshooting"/>
     <w:p>
       <w:pPr>
         <w:pStyle w:val="Heading2"/>
@@ -4131,7 +4702,7 @@
         <w:t xml:space="preserve">Tips and Troubleshooting</w:t>
       </w:r>
     </w:p>
-    <w:bookmarkStart w:id="46" w:name="a-download-failed-how-do-i-resume-it"/>
+    <w:bookmarkStart w:id="49" w:name="a-download-failed-how-do-i-resume-it"/>
     <w:p>
       <w:pPr>
         <w:pStyle w:val="Heading3"/>
@@ -4233,8 +4804,20 @@
         <w:t xml:space="preserve">files and resumes automatically.</w:t>
       </w:r>
     </w:p>
-    <w:bookmarkEnd w:id="46"/>
-    <w:bookmarkStart w:id="47" w:name="the-server-crawl-returns-zero-files"/>
+    <w:p>
+      <w:pPr>
+        <w:numPr>
+          <w:ilvl w:val="0"/>
+          <w:numId w:val="1011"/>
+        </w:numPr>
+        <w:pStyle w:val="Compact"/>
+      </w:pPr>
+      <w:r>
+        <w:t xml:space="preserve">Already-completed replacements in that session will already have had their old versions deleted.</w:t>
+      </w:r>
+    </w:p>
+    <w:bookmarkEnd w:id="49"/>
+    <w:bookmarkStart w:id="50" w:name="the-server-crawl-returns-zero-files"/>
     <w:p>
       <w:pPr>
         <w:pStyle w:val="Heading3"/>
@@ -4352,8 +4935,8 @@
         <w:t xml:space="preserve">in the script.</w:t>
       </w:r>
     </w:p>
-    <w:bookmarkEnd w:id="47"/>
-    <w:bookmarkStart w:id="48" w:name="the-server-crawl-is-very-slow"/>
+    <w:bookmarkEnd w:id="50"/>
+    <w:bookmarkStart w:id="51" w:name="the-server-crawl-is-very-slow"/>
     <w:p>
       <w:pPr>
         <w:pStyle w:val="Heading3"/>
@@ -4370,8 +4953,8 @@
         <w:t xml:space="preserve">The script scans each category subdirectory in sequence. This is normal — the server has many directories. A full scan typically takes one to a few minutes depending on network conditions.</w:t>
       </w:r>
     </w:p>
-    <w:bookmarkEnd w:id="48"/>
-    <w:bookmarkStart w:id="49" w:name="X7ee12cd1a85d563669771b66d6def6ce97b31ba"/>
+    <w:bookmarkEnd w:id="51"/>
+    <w:bookmarkStart w:id="52" w:name="X7ee12cd1a85d563669771b66d6def6ce97b31ba"/>
     <w:p>
       <w:pPr>
         <w:pStyle w:val="Heading3"/>
@@ -4430,8 +5013,8 @@
         <w:t xml:space="preserve">date pattern will not be compared correctly.</w:t>
       </w:r>
     </w:p>
-    <w:bookmarkEnd w:id="49"/>
-    <w:bookmarkStart w:id="50" w:name="torrent-downloads-show-0-seeds-peers"/>
+    <w:bookmarkEnd w:id="52"/>
+    <w:bookmarkStart w:id="53" w:name="torrent-downloads-show-0-seeds-peers"/>
     <w:p>
       <w:pPr>
         <w:pStyle w:val="Heading3"/>
@@ -4448,8 +5031,8 @@
         <w:t xml:space="preserve">Wait a minute or two — peers are discovered gradually. If activity remains at zero for several minutes, the torrent may be poorly seeded. The script will fall back to HTTP if the torrent path fails.</w:t>
       </w:r>
     </w:p>
-    <w:bookmarkEnd w:id="50"/>
-    <w:bookmarkStart w:id="51" w:name="a-file-ended-up-in-zimscorrupt"/>
+    <w:bookmarkEnd w:id="53"/>
+    <w:bookmarkStart w:id="54" w:name="a-file-ended-up-in-zimscorrupt"/>
     <w:p>
       <w:pPr>
         <w:pStyle w:val="Heading3"/>
@@ -4463,26 +5046,27 @@
         <w:pStyle w:val="FirstParagraph"/>
       </w:pPr>
       <w:r>
-        <w:t xml:space="preserve">The file failed integrity verification. You can attempt to re-download it by running Option 3 (which will treat the missing completed</w:t>
-      </w:r>
-      <w:r>
-        <w:t xml:space="preserve"> </w:t>
-      </w:r>
-      <w:r>
-        <w:rPr>
-          <w:rStyle w:val="VerbatimChar"/>
-        </w:rPr>
-        <w:t xml:space="preserve">.zim</w:t>
-      </w:r>
-      <w:r>
-        <w:t xml:space="preserve"> </w:t>
-      </w:r>
-      <w:r>
-        <w:t xml:space="preserve">as needed) or by deleting the corrupt entry and running Option 2.</w:t>
-      </w:r>
-    </w:p>
-    <w:bookmarkEnd w:id="51"/>
-    <w:bookmarkStart w:id="52" w:name="X2801c8c31640f0dd9d0820d65e9ad47621c904b"/>
+        <w:t xml:space="preserve">The file failed integrity verification. The previous good version (if any) was</w:t>
+      </w:r>
+      <w:r>
+        <w:t xml:space="preserve"> </w:t>
+      </w:r>
+      <w:r>
+        <w:rPr>
+          <w:bCs/>
+          <w:b/>
+        </w:rPr>
+        <w:t xml:space="preserve">not</w:t>
+      </w:r>
+      <w:r>
+        <w:t xml:space="preserve"> </w:t>
+      </w:r>
+      <w:r>
+        <w:t xml:space="preserve">deleted. You can attempt to re-download by running Option 3 or by deleting the corrupt entry and running Option 2.</w:t>
+      </w:r>
+    </w:p>
+    <w:bookmarkEnd w:id="54"/>
+    <w:bookmarkStart w:id="55" w:name="X2801c8c31640f0dd9d0820d65e9ad47621c904b"/>
     <w:p>
       <w:pPr>
         <w:pStyle w:val="Heading3"/>
@@ -4514,8 +5098,8 @@
         <w:t xml:space="preserve">in any text editor. Each line lists a filename, its human-readable size, byte size, HTTP URL, and torrent URL (when available).</w:t>
       </w:r>
     </w:p>
-    <w:bookmarkEnd w:id="52"/>
-    <w:bookmarkStart w:id="53" w:name="Xbfc241c979a67c408930c3451ad2b3b71642c56"/>
+    <w:bookmarkEnd w:id="55"/>
+    <w:bookmarkStart w:id="56" w:name="Xbfc241c979a67c408930c3451ad2b3b71642c56"/>
     <w:p>
       <w:pPr>
         <w:pStyle w:val="Heading3"/>
@@ -4529,7 +5113,73 @@
         <w:pStyle w:val="FirstParagraph"/>
       </w:pPr>
       <w:r>
-        <w:t xml:space="preserve">The required-space calculation treats incomplete / missing files as needing their full catalogued size, plus a safety buffer (default 10 GiB or 10% of remaining, whichever is larger). Completed files on disk contribute zero additional required space.</w:t>
+        <w:t xml:space="preserve">The required figure is</w:t>
+      </w:r>
+      <w:r>
+        <w:t xml:space="preserve"> </w:t>
+      </w:r>
+      <w:r>
+        <w:rPr>
+          <w:bCs/>
+          <w:b/>
+        </w:rPr>
+        <w:t xml:space="preserve">net</w:t>
+      </w:r>
+      <w:r>
+        <w:t xml:space="preserve"> </w:t>
+      </w:r>
+      <w:r>
+        <w:t xml:space="preserve">after reclaiming old versions, plus a safety buffer. Peak concurrent usage (up to 4 parallel downloads) can still briefly exceed the net figure while new files are writing and old ones have not yet been deleted. If the drive is truly tight, reduce concurrent downloads or free space manually before starting.</w:t>
+      </w:r>
+    </w:p>
+    <w:bookmarkEnd w:id="56"/>
+    <w:bookmarkStart w:id="57" w:name="when-are-old-files-actually-deleted"/>
+    <w:p>
+      <w:pPr>
+        <w:pStyle w:val="Heading3"/>
+      </w:pPr>
+      <w:r>
+        <w:t xml:space="preserve">When are old files actually deleted?</w:t>
+      </w:r>
+    </w:p>
+    <w:p>
+      <w:pPr>
+        <w:pStyle w:val="FirstParagraph"/>
+      </w:pPr>
+      <w:r>
+        <w:t xml:space="preserve">Immediately after each replacement finishes downloading</w:t>
+      </w:r>
+      <w:r>
+        <w:t xml:space="preserve"> </w:t>
+      </w:r>
+      <w:r>
+        <w:rPr>
+          <w:bCs/>
+          <w:b/>
+        </w:rPr>
+        <w:t xml:space="preserve">and</w:t>
+      </w:r>
+      <w:r>
+        <w:t xml:space="preserve"> </w:t>
+      </w:r>
+      <w:r>
+        <w:t xml:space="preserve">passes integrity verification — one file at a time, as that worker completes. The script does</w:t>
+      </w:r>
+      <w:r>
+        <w:t xml:space="preserve"> </w:t>
+      </w:r>
+      <w:r>
+        <w:rPr>
+          <w:bCs/>
+          <w:b/>
+        </w:rPr>
+        <w:t xml:space="preserve">not</w:t>
+      </w:r>
+      <w:r>
+        <w:t xml:space="preserve"> </w:t>
+      </w:r>
+      <w:r>
+        <w:t xml:space="preserve">wait until the entire download batch is finished.</w:t>
       </w:r>
     </w:p>
     <w:p>
@@ -4539,9 +5189,9 @@
         </w:pict>
       </w:r>
     </w:p>
-    <w:bookmarkEnd w:id="53"/>
-    <w:bookmarkEnd w:id="54"/>
-    <w:bookmarkStart w:id="55" w:name="license"/>
+    <w:bookmarkEnd w:id="57"/>
+    <w:bookmarkEnd w:id="58"/>
+    <w:bookmarkStart w:id="59" w:name="license"/>
     <w:p>
       <w:pPr>
         <w:pStyle w:val="Heading2"/>
@@ -4558,8 +5208,8 @@
         <w:t xml:space="preserve">MIT.</w:t>
       </w:r>
     </w:p>
-    <w:bookmarkEnd w:id="55"/>
-    <w:bookmarkEnd w:id="56"/>
+    <w:bookmarkEnd w:id="59"/>
+    <w:bookmarkEnd w:id="60"/>
     <w:sectPr/>
   </w:body>
 </w:document>

</xml_diff>